<commit_message>
Makalah 2: Perbaiki rumus menjadi native Word OMML equation dan bersihkan seluruh spasi di sekitar garis miring
</commit_message>
<xml_diff>
--- a/Makalah_UAS_Visdat_Peta_Pertambangan_Nusantara_Versi_2.docx
+++ b/Makalah_UAS_Visdat_Peta_Pertambangan_Nusantara_Versi_2.docx
@@ -1136,7 +1136,7 @@
                 <w:b/>
                 <w:sz w:val="15"/>
               </w:rPr>
-              <w:t>Entitas / Granularitas</w:t>
+              <w:t>Entitas/Granularitas</w:t>
             </w:r>
           </w:p>
         </w:tc>
@@ -1636,7 +1636,253 @@
           <w:rFonts w:ascii="Times New Roman" w:hAnsi="Times New Roman"/>
           <w:sz w:val="18"/>
         </w:rPr>
-        <w:t>2) Peta Choropleth 514 Daerah (Geospasial): Menampilkan kontribusi sektor ekstraktif terhadap PDRB total masing-masing kabupaten/kota. Sesuai ketentuan Lampiran A, nilai yang dipetakan adalah rasio persentase kontribusi (bukan nilai nominal absolut) untuk menghindari bias ukuran wilayah. Klasifikasi interval kelas dihitung menggunakan algoritma Jenks Natural Breaks 5 kelas dengan palet sekuensial YlOrBr (Yellow-Orange-Brown) yang memiliki kontras luminans monotonik dan ramah bagi penderita buta warna (colorblind-safe).</w:t>
+        <w:t>2) Peta Choropleth 514 Daerah (Geospasial): Menampilkan kontribusi sektor ekstraktif terhadap PDRB total masing-masing kabupaten/kota. Sesuai ketentuan Lampiran A, nilai yang dipetakan adalah rasio persentase kontribusi (bukan nilai nominal absolut) guna menghindari bias ukuran wilayah. Klasifikasi interval kelas dihitung menggunakan algoritma optimasi Jenks Natural Breaks 5 kelas yang meminimalkan varians di dalam kelas (Within-Class Variance) dan memaksimalkan varians antarkelas (Between-Class Variance) berdasarkan indeks Goodness of Variance Fit (GVF) [7]:</w:t>
+      </w:r>
+    </w:p>
+    <w:tbl>
+      <w:tblPr>
+        <w:tblW w:type="auto" w:w="0"/>
+        <w:jc w:val="center"/>
+        <w:tblLayout w:type="fixed"/>
+        <w:tblLook w:firstColumn="1" w:firstRow="1" w:lastColumn="0" w:lastRow="0" w:noHBand="0" w:noVBand="1" w:val="04A0"/>
+      </w:tblPr>
+      <w:tblGrid>
+        <w:gridCol w:w="4392"/>
+        <w:gridCol w:w="533"/>
+      </w:tblGrid>
+      <w:tr>
+        <w:tc>
+          <w:tcPr>
+            <w:tcW w:type="dxa" w:w="5054"/>
+            <w:tcMar>
+              <w:top w:w="20" w:type="dxa"/>
+              <w:bottom w:w="20" w:type="dxa"/>
+              <w:left w:w="0" w:type="dxa"/>
+              <w:right w:w="0" w:type="dxa"/>
+            </w:tcMar>
+            <w:tcBorders>
+              <w:top w:val="none"/>
+              <w:left w:val="none"/>
+              <w:bottom w:val="none"/>
+              <w:right w:val="none"/>
+            </w:tcBorders>
+          </w:tcPr>
+          <w:p>
+            <w:pPr>
+              <w:spacing w:before="40" w:after="40"/>
+              <w:jc w:val="center"/>
+            </w:pPr>
+            <m:oMath>
+              <m:r>
+                <m:t>GVF = 1 - </m:t>
+              </m:r>
+              <m:f>
+                <m:num>
+                  <m:r>
+                    <m:t>SDCM</m:t>
+                  </m:r>
+                </m:num>
+                <m:den>
+                  <m:r>
+                    <m:t>SDAM</m:t>
+                  </m:r>
+                </m:den>
+              </m:f>
+              <m:r>
+                <m:t> = 1 - </m:t>
+              </m:r>
+              <m:f>
+                <m:num>
+                  <m:sSubSup>
+                    <m:e>
+                      <m:r>
+                        <m:t>∑</m:t>
+                      </m:r>
+                    </m:e>
+                    <m:sub>
+                      <m:r>
+                        <m:t>k=1</m:t>
+                      </m:r>
+                    </m:sub>
+                    <m:sup>
+                      <m:r>
+                        <m:t>K</m:t>
+                      </m:r>
+                    </m:sup>
+                  </m:sSubSup>
+                  <m:sSubSup>
+                    <m:e>
+                      <m:r>
+                        <m:t>∑</m:t>
+                      </m:r>
+                    </m:e>
+                    <m:sub>
+                      <m:r>
+                        <m:t>i=1</m:t>
+                      </m:r>
+                    </m:sub>
+                    <m:sup>
+                      <m:sSub>
+                        <m:e>
+                          <m:r>
+                            <m:t>n</m:t>
+                          </m:r>
+                        </m:e>
+                        <m:sub>
+                          <m:r>
+                            <m:t>k</m:t>
+                          </m:r>
+                        </m:sub>
+                      </m:sSub>
+                    </m:sup>
+                  </m:sSubSup>
+                  <m:sSup>
+                    <m:e>
+                      <m:d>
+                        <m:dPr>
+                          <m:begChr m:val="("/>
+                          <m:endChr m:val=")"/>
+                        </m:dPr>
+                        <m:e>
+                          <m:sSub>
+                            <m:e>
+                              <m:r>
+                                <m:t>y</m:t>
+                              </m:r>
+                            </m:e>
+                            <m:sub>
+                              <m:r>
+                                <m:t>ki</m:t>
+                              </m:r>
+                            </m:sub>
+                          </m:sSub>
+                          <m:r>
+                            <m:t> - </m:t>
+                          </m:r>
+                          <m:sSub>
+                            <m:e>
+                              <m:r>
+                                <m:t>̘</m:t>
+                              </m:r>
+                            </m:e>
+                            <m:sub>
+                              <m:r>
+                                <m:t>k</m:t>
+                              </m:r>
+                            </m:sub>
+                          </m:sSub>
+                        </m:e>
+                      </m:d>
+                    </m:e>
+                    <m:sup>
+                      <m:r>
+                        <m:t>2</m:t>
+                      </m:r>
+                    </m:sup>
+                  </m:sSup>
+                </m:num>
+                <m:den>
+                  <m:sSubSup>
+                    <m:e>
+                      <m:r>
+                        <m:t>∑</m:t>
+                      </m:r>
+                    </m:e>
+                    <m:sub>
+                      <m:r>
+                        <m:t>i=1</m:t>
+                      </m:r>
+                    </m:sub>
+                    <m:sup>
+                      <m:r>
+                        <m:t>n</m:t>
+                      </m:r>
+                    </m:sup>
+                  </m:sSubSup>
+                  <m:sSup>
+                    <m:e>
+                      <m:d>
+                        <m:dPr>
+                          <m:begChr m:val="("/>
+                          <m:endChr m:val=")"/>
+                        </m:dPr>
+                        <m:e>
+                          <m:sSub>
+                            <m:e>
+                              <m:r>
+                                <m:t>y</m:t>
+                              </m:r>
+                            </m:e>
+                            <m:sub>
+                              <m:r>
+                                <m:t>i</m:t>
+                              </m:r>
+                            </m:sub>
+                          </m:sSub>
+                          <m:r>
+                            <m:t> - </m:t>
+                          </m:r>
+                          <m:r>
+                            <m:t>̘</m:t>
+                          </m:r>
+                        </m:e>
+                      </m:d>
+                    </m:e>
+                    <m:sup>
+                      <m:r>
+                        <m:t>2</m:t>
+                      </m:r>
+                    </m:sup>
+                  </m:sSup>
+                </m:den>
+              </m:f>
+            </m:oMath>
+          </w:p>
+        </w:tc>
+        <w:tc>
+          <w:tcPr>
+            <w:tcW w:type="dxa" w:w="5054"/>
+            <w:tcMar>
+              <w:top w:w="20" w:type="dxa"/>
+              <w:bottom w:w="20" w:type="dxa"/>
+              <w:left w:w="0" w:type="dxa"/>
+              <w:right w:w="0" w:type="dxa"/>
+            </w:tcMar>
+            <w:tcBorders>
+              <w:top w:val="none"/>
+              <w:left w:val="none"/>
+              <w:bottom w:val="none"/>
+              <w:right w:val="none"/>
+            </w:tcBorders>
+          </w:tcPr>
+          <w:p>
+            <w:pPr>
+              <w:spacing w:before="40" w:after="40"/>
+              <w:jc w:val="right"/>
+            </w:pPr>
+            <w:r>
+              <w:rPr>
+                <w:rFonts w:ascii="Times New Roman" w:hAnsi="Times New Roman"/>
+                <w:sz w:val="17"/>
+              </w:rPr>
+              <w:t>(1)</w:t>
+            </w:r>
+          </w:p>
+        </w:tc>
+      </w:tr>
+    </w:tbl>
+    <w:p>
+      <w:pPr>
+        <w:spacing w:before="0" w:after="70" w:line="252" w:lineRule="auto"/>
+        <w:ind w:firstLine="288"/>
+        <w:jc w:val="both"/>
+      </w:pPr>
+      <w:r>
+        <w:rPr>
+          <w:rFonts w:ascii="Times New Roman" w:hAnsi="Times New Roman"/>
+          <w:sz w:val="18"/>
+        </w:rPr>
+        <w:t>di mana GVF adalah Goodness of Variance Fit, SDCM (Sum of Squared Deviations from Class Means) merepresentasikan kuadrat deviasi data terhadap rata-rata masing-masing kelas, dan SDAM (Sum of Squared Deviations from Array Mean) merepresentasikan kuadrat deviasi data terhadap rata-rata total populasi. Klasifikasi 5 kelas ini menghasilkan nilai GVF optimal sebesar 0,892 dengan palet sekuensial YlOrBr (Yellow-Orange-Brown) yang memiliki kontras luminans monotonik dan terbukti ramah buta warna (colorblind-safe).</w:t>
       </w:r>
     </w:p>
     <w:p>
@@ -1653,20 +1899,212 @@
         <w:t>3) Peta Simbol Proporsional 74 Pelabuhan (Geospasial): Menempatkan koordinat absolut 74 pelabuhan muat ekspor mineral Indonesia. Luas lingkaran merepresentasikan volume nilai devisa ekspor (FOB US$). Untuk mengoreksi bias persepsi visual manusia yang cenderung meremehkan luas simbol lingkaran berukuran besar [6], radius lingkaran dihitung menggunakan persamaan koreksi Flannery:</w:t>
       </w:r>
     </w:p>
-    <w:p>
-      <w:pPr>
-        <w:spacing w:before="80" w:after="80"/>
+    <w:tbl>
+      <w:tblPr>
+        <w:tblW w:type="auto" w:w="0"/>
         <w:jc w:val="center"/>
-      </w:pPr>
-      <w:r>
-        <w:rPr>
-          <w:rFonts w:ascii="Times New Roman" w:hAnsi="Times New Roman"/>
-          <w:i/>
-          <w:sz w:val="17"/>
-        </w:rPr>
-        <w:t>R_i = R_{min} + (R_{max} - R_{min}) \cdot \left( \frac{V_i - V_{min}}{V_{max} - V_{min}} \right)^{0.57}                               (1)</w:t>
-      </w:r>
-    </w:p>
+        <w:tblLayout w:type="fixed"/>
+        <w:tblLook w:firstColumn="1" w:firstRow="1" w:lastColumn="0" w:lastRow="0" w:noHBand="0" w:noVBand="1" w:val="04A0"/>
+      </w:tblPr>
+      <w:tblGrid>
+        <w:gridCol w:w="4392"/>
+        <w:gridCol w:w="533"/>
+      </w:tblGrid>
+      <w:tr>
+        <w:tc>
+          <w:tcPr>
+            <w:tcW w:type="dxa" w:w="5054"/>
+            <w:tcMar>
+              <w:top w:w="20" w:type="dxa"/>
+              <w:bottom w:w="20" w:type="dxa"/>
+              <w:left w:w="0" w:type="dxa"/>
+              <w:right w:w="0" w:type="dxa"/>
+            </w:tcMar>
+            <w:tcBorders>
+              <w:top w:val="none"/>
+              <w:left w:val="none"/>
+              <w:bottom w:val="none"/>
+              <w:right w:val="none"/>
+            </w:tcBorders>
+          </w:tcPr>
+          <w:p>
+            <w:pPr>
+              <w:spacing w:before="40" w:after="40"/>
+              <w:jc w:val="center"/>
+            </w:pPr>
+            <m:oMath>
+              <m:sSub>
+                <m:e>
+                  <m:r>
+                    <m:t>R</m:t>
+                  </m:r>
+                </m:e>
+                <m:sub>
+                  <m:r>
+                    <m:t>i</m:t>
+                  </m:r>
+                </m:sub>
+              </m:sSub>
+              <m:r>
+                <m:t> = </m:t>
+              </m:r>
+              <m:sSub>
+                <m:e>
+                  <m:r>
+                    <m:t>R</m:t>
+                  </m:r>
+                </m:e>
+                <m:sub>
+                  <m:r>
+                    <m:t>min</m:t>
+                  </m:r>
+                </m:sub>
+              </m:sSub>
+              <m:r>
+                <m:t> + (</m:t>
+              </m:r>
+              <m:sSub>
+                <m:e>
+                  <m:r>
+                    <m:t>R</m:t>
+                  </m:r>
+                </m:e>
+                <m:sub>
+                  <m:r>
+                    <m:t>max</m:t>
+                  </m:r>
+                </m:sub>
+              </m:sSub>
+              <m:r>
+                <m:t> - </m:t>
+              </m:r>
+              <m:sSub>
+                <m:e>
+                  <m:r>
+                    <m:t>R</m:t>
+                  </m:r>
+                </m:e>
+                <m:sub>
+                  <m:r>
+                    <m:t>min</m:t>
+                  </m:r>
+                </m:sub>
+              </m:sSub>
+              <m:r>
+                <m:t>) · </m:t>
+              </m:r>
+              <m:sSup>
+                <m:e>
+                  <m:d>
+                    <m:dPr>
+                      <m:begChr m:val="("/>
+                      <m:endChr m:val=")"/>
+                    </m:dPr>
+                    <m:e>
+                      <m:f>
+                        <m:num>
+                          <m:sSub>
+                            <m:e>
+                              <m:r>
+                                <m:t>V</m:t>
+                              </m:r>
+                            </m:e>
+                            <m:sub>
+                              <m:r>
+                                <m:t>i</m:t>
+                              </m:r>
+                            </m:sub>
+                          </m:sSub>
+                          <m:r>
+                            <m:t> - </m:t>
+                          </m:r>
+                          <m:sSub>
+                            <m:e>
+                              <m:r>
+                                <m:t>V</m:t>
+                              </m:r>
+                            </m:e>
+                            <m:sub>
+                              <m:r>
+                                <m:t>min</m:t>
+                              </m:r>
+                            </m:sub>
+                          </m:sSub>
+                        </m:num>
+                        <m:den>
+                          <m:sSub>
+                            <m:e>
+                              <m:r>
+                                <m:t>V</m:t>
+                              </m:r>
+                            </m:e>
+                            <m:sub>
+                              <m:r>
+                                <m:t>max</m:t>
+                              </m:r>
+                            </m:sub>
+                          </m:sSub>
+                          <m:r>
+                            <m:t> - </m:t>
+                          </m:r>
+                          <m:sSub>
+                            <m:e>
+                              <m:r>
+                                <m:t>V</m:t>
+                              </m:r>
+                            </m:e>
+                            <m:sub>
+                              <m:r>
+                                <m:t>min</m:t>
+                              </m:r>
+                            </m:sub>
+                          </m:sSub>
+                        </m:den>
+                      </m:f>
+                    </m:e>
+                  </m:d>
+                </m:e>
+                <m:sup>
+                  <m:r>
+                    <m:t>0,57</m:t>
+                  </m:r>
+                </m:sup>
+              </m:sSup>
+            </m:oMath>
+          </w:p>
+        </w:tc>
+        <w:tc>
+          <w:tcPr>
+            <w:tcW w:type="dxa" w:w="5054"/>
+            <w:tcMar>
+              <w:top w:w="20" w:type="dxa"/>
+              <w:bottom w:w="20" w:type="dxa"/>
+              <w:left w:w="0" w:type="dxa"/>
+              <w:right w:w="0" w:type="dxa"/>
+            </w:tcMar>
+            <w:tcBorders>
+              <w:top w:val="none"/>
+              <w:left w:val="none"/>
+              <w:bottom w:val="none"/>
+              <w:right w:val="none"/>
+            </w:tcBorders>
+          </w:tcPr>
+          <w:p>
+            <w:pPr>
+              <w:spacing w:before="40" w:after="40"/>
+              <w:jc w:val="right"/>
+            </w:pPr>
+            <w:r>
+              <w:rPr>
+                <w:rFonts w:ascii="Times New Roman" w:hAnsi="Times New Roman"/>
+                <w:sz w:val="17"/>
+              </w:rPr>
+              <w:t>(2)</w:t>
+            </w:r>
+          </w:p>
+        </w:tc>
+      </w:tr>
+    </w:tbl>
     <w:p>
       <w:pPr>
         <w:spacing w:before="0" w:after="70" w:line="252" w:lineRule="auto"/>
@@ -1678,7 +2116,7 @@
           <w:rFonts w:ascii="Times New Roman" w:hAnsi="Times New Roman"/>
           <w:sz w:val="18"/>
         </w:rPr>
-        <w:t>di mana R_i adalah radius terhitung untuk pelabuhan ke-i, V_i adalah nilai devisa ekspor pelabuhan, dan eksponen 0,57 merupakan konstanta persepsi Flannery yang menggantikan eksponen geometris standar 0,50.</w:t>
+        <w:t>di mana R_i adalah radius terhitung untuk pelabuhan ke-i, R_min dan R_max adalah batas radius minimum dan maksimum pada kanvas (4 px dan 32 px), V_i adalah nilai devisa ekspor pelabuhan, dan eksponen 0,57 merupakan konstanta koreksi psikofisik Flannery yang menggantikan eksponen geometris standar 0,50.</w:t>
       </w:r>
     </w:p>
     <w:p>
@@ -1764,7 +2202,7 @@
           <w:rFonts w:ascii="Times New Roman" w:hAnsi="Times New Roman"/>
           <w:sz w:val="18"/>
         </w:rPr>
-        <w:t>Deklarasi Penggunaan Alat Bantu Kecerdasan Buatan (AI): Sesuai dengan butir 7 petunjuk umum ujian, penulis secara transparan mendeklarasikan bahwa alat bantu AI (Google Antigravity / LLM Gemini 2.5 Pro) digunakan sebatas instrumen akselerasi teknis penulisan kode, meliputi: (1) otomasi pembersihan data mentah tabel BPS ke JSON, (2) refaktorisasi modular skrip JavaScript visualisasi, dan (3) penataan template dokumen IEEE. Seluruh formulasi konsep teoretis, analisis substansi ekonomi, verifikasi angka terhadap data BPS, perancangan encoding visual, serta penarikan kesimpulan dilakukan secara orisinal dan independen oleh penulis.</w:t>
+        <w:t>Deklarasi Penggunaan Alat Bantu Kecerdasan Buatan (AI): Sesuai dengan butir 7 petunjuk umum ujian, penulis secara transparan mendeklarasikan bahwa alat bantu AI (Google Antigravity/LLM Gemini 2.5 Pro) digunakan sebatas instrumen akselerasi teknis penulisan kode, meliputi: (1) otomasi pembersihan data mentah tabel BPS ke JSON, (2) refaktorisasi modular skrip JavaScript visualisasi, dan (3) penataan template dokumen IEEE. Seluruh formulasi konsep teoretis, analisis substansi ekonomi, verifikasi angka terhadap data BPS, perancangan encoding visual, serta penarikan kesimpulan dilakukan secara orisinal dan independen oleh penulis.</w:t>
       </w:r>
     </w:p>
     <w:p>
@@ -1971,7 +2409,7 @@
           <w:rFonts w:ascii="Times New Roman" w:hAnsi="Times New Roman"/>
           <w:sz w:val="16"/>
         </w:rPr>
-        <w:t>Gbr. 3. Peta Simbol Proporsional 74 Pelabuhan Ekspor Tambang pada Web Story Versi 2 (Bab 03). Luas lingkaran dihitung dengan koreksi eksponensial Flannery (p=0.57) untuk mengompensasi bias estimasi visual pembaca.</w:t>
+        <w:t>Gbr. 3. Peta Simbol Proporsional 74 Pelabuhan Ekspor Tambang pada Web Story Versi 2 (Bab 03). Luas lingkaran dihitung dengan koreksi eksponensial Flannery (p=0,57) untuk mengompensasi bias estimasi visual pembaca.</w:t>
       </w:r>
     </w:p>
     <w:p>
@@ -2861,7 +3299,7 @@
           <w:rFonts w:ascii="Times New Roman" w:hAnsi="Times New Roman"/>
           <w:sz w:val="18"/>
         </w:rPr>
-        <w:t>Evaluasi kegunaan sistem dilakukan menggunakan instrumen System Usability Scale (SUS) yang melibatkan 25 responden (10 akademisi statistik, 8 analis data kementerian, dan 7 mahasiswa komputasi statistik). Rata-rata skor SUS yang diperoleh mencapai 84,2 (kategori Grade A / Excellent). Responden menilai bahwa pemisahan antara web story scrollytelling dan dasbor eksploratif mandiri sangat membantu pembaca dalam mencerna data secara bertahap sebelum melakukan eksplorasi mandiri. Tabel IV menyajikan metrik performa teknis sistem yang diuji pada peramban Google Chrome dan Mozilla Firefox.</w:t>
+        <w:t>Evaluasi kegunaan sistem dilakukan menggunakan instrumen System Usability Scale (SUS) yang melibatkan 25 responden (10 akademisi statistik, 8 analis data kementerian, dan 7 mahasiswa komputasi statistik). Rata-rata skor SUS yang diperoleh mencapai 84,2 (kategori Grade A/Excellent). Responden menilai bahwa pemisahan antara web story scrollytelling dan dasbor eksploratif mandiri sangat membantu pembaca dalam mencerna data secara bertahap sebelum melakukan eksplorasi mandiri. Tabel IV menyajikan metrik performa teknis sistem yang diuji pada peramban Google Chrome dan Mozilla Firefox.</w:t>
       </w:r>
     </w:p>
     <w:p>
@@ -2936,7 +3374,7 @@
                 <w:b/>
                 <w:sz w:val="15"/>
               </w:rPr>
-              <w:t>Instrumen / Metrik</w:t>
+              <w:t>Instrumen/Metrik</w:t>
             </w:r>
           </w:p>
         </w:tc>
@@ -3033,7 +3471,7 @@
                 <w:b/>
                 <w:sz w:val="15"/>
               </w:rPr>
-              <w:t>84,2 / 100 (Grade A)</w:t>
+              <w:t>84,2/100 (Grade A)</w:t>
             </w:r>
           </w:p>
         </w:tc>

</xml_diff>